<commit_message>
docs(mjdrdypu): readability edits + QA report (originality, AI-signature, number integrity)
</commit_message>
<xml_diff>
--- a/india-ageing-atlas/submission_assets/MJDRDYPU_HEALTH_ECONOMICS_ELDERLY_2026-06-25/manuscript.docx
+++ b/india-ageing-atlas/submission_assets/MJDRDYPU_HEALTH_ECONOMICS_ELDERLY_2026-06-25/manuscript.docx
@@ -411,7 +411,7 @@
         <w:pStyle w:val="FirstParagraph"/>
       </w:pPr>
       <w:r>
-        <w:t xml:space="preserve">The economics of growing old in India is not, for most families, the economics of hospitalisation. It is the economics of the chronic, the routine and the recurring. Our central finding is the gap between two policy levers that look similar on paper but behave very differently in practice: covering hospital bills for older people removed less than a tenth of the catastrophic spending that covering their outpatient and medicine costs would remove. A financial-protection system built on admissions addresses the visible emergencies while leaving the slow, grinding cost of managing chronic disease where it has always sat, with the household.</w:t>
+        <w:t xml:space="preserve">The economics of growing old in India is not, for most families, the economics of hospitalisation. It is the economics of the chronic, the routine and the recurring. Our central finding is a gap between two policy levers that look similar on paper but behave very differently in practice. Covering hospital bills for older people removed less than a tenth of the catastrophic spending that covering their outpatient and medicine costs would remove. A financial-protection system built on admissions addresses the visible emergencies while leaving the slow, grinding cost of managing chronic disease where it has always sat, with the household.</w:t>
       </w:r>
     </w:p>
     <w:p>
@@ -419,7 +419,7 @@
         <w:pStyle w:val="BodyText"/>
       </w:pPr>
       <w:r>
-        <w:t xml:space="preserve">This matters because the cost it leaves behind falls hardest on those least able to bear it. Rural older adults were the most likely to spend catastrophically, the most likely to be impoverished by it, and the strongest single group the predictive model identified. The mildly pro-rich concentration index should not be read as reassurance; its decomposition shows that rural households carry a burden that is heavy relative to their means, masked in the aggregate by the larger discretionary spending of wealthier urban ones.</w:t>
+        <w:t xml:space="preserve">This matters because the cost it leaves behind falls hardest on those least able to bear it. Rural older adults were the most likely to spend catastrophically, the most likely to be impoverished by it, and the strongest single group the predictive model identified. The mildly pro-rich concentration index should not be read as reassurance. Its decomposition shows that rural households carry a burden that is heavy relative to their means. In the aggregate, this is hidden by the larger discretionary spending of wealthier urban households.</w:t>
       </w:r>
     </w:p>
     <w:p>
@@ -452,7 +452,7 @@
         <w:pStyle w:val="FirstParagraph"/>
       </w:pPr>
       <w:r>
-        <w:t xml:space="preserve">Several cautions apply. The data are cross-sectional, so we describe burden and association, not change over time or causation. Spending and care are self-reported and subject to recall. Our household outpatient measure captures medicines bought in the course of treatment but may under-record standalone pharmacy purchases for chronic conditions, so the true outpatient burden, and the benefit of covering it, may be larger than we estimate; this makes our central comparison conservative rather than overstated. The machine-learning results describe prediction, not cause. The microsimulation is a static counterfactual that assumes full uptake and full reimbursement, which is why the combined scenario should be read as an upper bound. Finally, the care-worker wage used to value unpaid care is an assumption, and we report it as such.</w:t>
+        <w:t xml:space="preserve">Several cautions apply. The data are cross-sectional, so we describe burden and association, not change over time or causation. Spending and care are self-reported and subject to recall. Our household outpatient measure captures medicines bought in the course of treatment, but it may under-record standalone pharmacy purchases for chronic conditions. The true outpatient burden, and the benefit of covering it, may therefore be larger than we estimate. That makes our central comparison conservative rather than overstated. The machine-learning results describe prediction, not cause. The microsimulation is a static counterfactual that assumes full uptake and full reimbursement, which is why the combined scenario should be read as an upper bound. Finally, the care-worker wage used to value unpaid care is an assumption, and we report it as such.</w:t>
       </w:r>
     </w:p>
     <w:bookmarkEnd w:id="25"/>

</xml_diff>